<commit_message>
Feat: Updated AZP1523A1 defines and added details and captures to functional test
</commit_message>
<xml_diff>
--- a/Functional Tests.docx
+++ b/Functional Tests.docx
@@ -104,15 +104,7 @@
     </w:p>
     <w:p>
       <w:r>
-        <w:t xml:space="preserve">Test the minimum pulse width the </w:t>
-      </w:r>
-      <w:proofErr w:type="spellStart"/>
-      <w:r>
-        <w:t>analyzer</w:t>
-      </w:r>
-      <w:proofErr w:type="spellEnd"/>
-      <w:r>
-        <w:t xml:space="preserve"> can detect. [</w:t>
+        <w:t>Test the minimum pulse width the analyzer can detect. [</w:t>
       </w:r>
       <w:hyperlink r:id="rId6" w:history="1">
         <w:r>
@@ -282,15 +274,7 @@
     </w:p>
     <w:p>
       <w:r>
-        <w:t xml:space="preserve">Ensure the </w:t>
-      </w:r>
-      <w:proofErr w:type="spellStart"/>
-      <w:r>
-        <w:t>analyzer</w:t>
-      </w:r>
-      <w:proofErr w:type="spellEnd"/>
-      <w:r>
-        <w:t xml:space="preserve"> starts recording exactly when the trigger condition is met. [</w:t>
+        <w:t>Ensure the analyzer starts recording exactly when the trigger condition is met. [</w:t>
       </w:r>
       <w:hyperlink r:id="rId8" w:history="1">
         <w:r>
@@ -538,6 +522,243 @@
       </w:r>
       <w:r>
         <w:t xml:space="preserve"> Monitor for "Buffer Overflow" errors in your software or FPGA logic.</w:t>
+      </w:r>
+    </w:p>
+    <w:p/>
+    <w:p/>
+    <w:p/>
+    <w:p/>
+    <w:p/>
+    <w:p/>
+    <w:p/>
+    <w:p/>
+    <w:p/>
+    <w:p/>
+    <w:p/>
+    <w:p/>
+    <w:p/>
+    <w:p/>
+    <w:p/>
+    <w:p/>
+    <w:p/>
+    <w:p/>
+    <w:p/>
+    <w:p>
+      <w:pPr>
+        <w:pStyle w:val="ListParagraph"/>
+        <w:numPr>
+          <w:ilvl w:val="0"/>
+          <w:numId w:val="7"/>
+        </w:numPr>
+      </w:pPr>
+      <w:r>
+        <w:rPr>
+          <w:b/>
+          <w:bCs/>
+        </w:rPr>
+        <w:lastRenderedPageBreak/>
+        <w:t>Maximum Sample Rate Test</w:t>
+      </w:r>
+    </w:p>
+    <w:p>
+      <w:r>
+        <w:drawing>
+          <wp:inline distT="0" distB="0" distL="0" distR="0" wp14:anchorId="662CCDE0" wp14:editId="0AE60625">
+            <wp:extent cx="5731510" cy="2959100"/>
+            <wp:effectExtent l="0" t="0" r="2540" b="0"/>
+            <wp:docPr id="963625641" name="Picture 1"/>
+            <wp:cNvGraphicFramePr>
+              <a:graphicFrameLocks xmlns:a="http://schemas.openxmlformats.org/drawingml/2006/main" noChangeAspect="1"/>
+            </wp:cNvGraphicFramePr>
+            <a:graphic xmlns:a="http://schemas.openxmlformats.org/drawingml/2006/main">
+              <a:graphicData uri="http://schemas.openxmlformats.org/drawingml/2006/picture">
+                <pic:pic xmlns:pic="http://schemas.openxmlformats.org/drawingml/2006/picture">
+                  <pic:nvPicPr>
+                    <pic:cNvPr id="963625641" name=""/>
+                    <pic:cNvPicPr/>
+                  </pic:nvPicPr>
+                  <pic:blipFill>
+                    <a:blip r:embed="rId12"/>
+                    <a:stretch>
+                      <a:fillRect/>
+                    </a:stretch>
+                  </pic:blipFill>
+                  <pic:spPr>
+                    <a:xfrm>
+                      <a:off x="0" y="0"/>
+                      <a:ext cx="5731510" cy="2959100"/>
+                    </a:xfrm>
+                    <a:prstGeom prst="rect">
+                      <a:avLst/>
+                    </a:prstGeom>
+                  </pic:spPr>
+                </pic:pic>
+              </a:graphicData>
+            </a:graphic>
+          </wp:inline>
+        </w:drawing>
+      </w:r>
+    </w:p>
+    <w:p>
+      <w:r>
+        <w:rPr>
+          <w:noProof/>
+        </w:rPr>
+        <w:drawing>
+          <wp:inline distT="0" distB="0" distL="0" distR="0" wp14:anchorId="0254A408" wp14:editId="07AA690A">
+            <wp:extent cx="5731510" cy="4298950"/>
+            <wp:effectExtent l="0" t="0" r="2540" b="6350"/>
+            <wp:docPr id="1632492550" name="Picture 2"/>
+            <wp:cNvGraphicFramePr>
+              <a:graphicFrameLocks xmlns:a="http://schemas.openxmlformats.org/drawingml/2006/main" noChangeAspect="1"/>
+            </wp:cNvGraphicFramePr>
+            <a:graphic xmlns:a="http://schemas.openxmlformats.org/drawingml/2006/main">
+              <a:graphicData uri="http://schemas.openxmlformats.org/drawingml/2006/picture">
+                <pic:pic xmlns:pic="http://schemas.openxmlformats.org/drawingml/2006/picture">
+                  <pic:nvPicPr>
+                    <pic:cNvPr id="1632492550" name="Picture 1632492550"/>
+                    <pic:cNvPicPr/>
+                  </pic:nvPicPr>
+                  <pic:blipFill>
+                    <a:blip r:embed="rId13">
+                      <a:extLst>
+                        <a:ext uri="{28A0092B-C50C-407E-A947-70E740481C1C}">
+                          <a14:useLocalDpi xmlns:a14="http://schemas.microsoft.com/office/drawing/2010/main" val="0"/>
+                        </a:ext>
+                      </a:extLst>
+                    </a:blip>
+                    <a:stretch>
+                      <a:fillRect/>
+                    </a:stretch>
+                  </pic:blipFill>
+                  <pic:spPr>
+                    <a:xfrm>
+                      <a:off x="0" y="0"/>
+                      <a:ext cx="5731510" cy="4298950"/>
+                    </a:xfrm>
+                    <a:prstGeom prst="rect">
+                      <a:avLst/>
+                    </a:prstGeom>
+                  </pic:spPr>
+                </pic:pic>
+              </a:graphicData>
+            </a:graphic>
+          </wp:inline>
+        </w:drawing>
+      </w:r>
+    </w:p>
+    <w:p/>
+    <w:p>
+      <w:pPr>
+        <w:pStyle w:val="ListParagraph"/>
+        <w:numPr>
+          <w:ilvl w:val="0"/>
+          <w:numId w:val="7"/>
+        </w:numPr>
+      </w:pPr>
+      <w:r>
+        <w:t xml:space="preserve">Threshold and Logic Trigger </w:t>
+      </w:r>
+    </w:p>
+    <w:p>
+      <w:r>
+        <w:rPr>
+          <w:noProof/>
+        </w:rPr>
+        <w:lastRenderedPageBreak/>
+        <w:drawing>
+          <wp:inline distT="0" distB="0" distL="0" distR="0" wp14:anchorId="2C52A378" wp14:editId="1109E520">
+            <wp:extent cx="5731510" cy="4298950"/>
+            <wp:effectExtent l="0" t="0" r="2540" b="6350"/>
+            <wp:docPr id="233342437" name="Picture 1"/>
+            <wp:cNvGraphicFramePr>
+              <a:graphicFrameLocks xmlns:a="http://schemas.openxmlformats.org/drawingml/2006/main" noChangeAspect="1"/>
+            </wp:cNvGraphicFramePr>
+            <a:graphic xmlns:a="http://schemas.openxmlformats.org/drawingml/2006/main">
+              <a:graphicData uri="http://schemas.openxmlformats.org/drawingml/2006/picture">
+                <pic:pic xmlns:pic="http://schemas.openxmlformats.org/drawingml/2006/picture">
+                  <pic:nvPicPr>
+                    <pic:cNvPr id="233342437" name="Picture 233342437"/>
+                    <pic:cNvPicPr/>
+                  </pic:nvPicPr>
+                  <pic:blipFill>
+                    <a:blip r:embed="rId14">
+                      <a:extLst>
+                        <a:ext uri="{28A0092B-C50C-407E-A947-70E740481C1C}">
+                          <a14:useLocalDpi xmlns:a14="http://schemas.microsoft.com/office/drawing/2010/main" val="0"/>
+                        </a:ext>
+                      </a:extLst>
+                    </a:blip>
+                    <a:stretch>
+                      <a:fillRect/>
+                    </a:stretch>
+                  </pic:blipFill>
+                  <pic:spPr>
+                    <a:xfrm>
+                      <a:off x="0" y="0"/>
+                      <a:ext cx="5731510" cy="4298950"/>
+                    </a:xfrm>
+                    <a:prstGeom prst="rect">
+                      <a:avLst/>
+                    </a:prstGeom>
+                  </pic:spPr>
+                </pic:pic>
+              </a:graphicData>
+            </a:graphic>
+          </wp:inline>
+        </w:drawing>
+      </w:r>
+    </w:p>
+    <w:p>
+      <w:pPr>
+        <w:pStyle w:val="ListParagraph"/>
+        <w:numPr>
+          <w:ilvl w:val="0"/>
+          <w:numId w:val="7"/>
+        </w:numPr>
+      </w:pPr>
+      <w:r>
+        <w:t>Minimum Pulse Width</w:t>
+      </w:r>
+    </w:p>
+    <w:p>
+      <w:r>
+        <w:lastRenderedPageBreak/>
+        <w:drawing>
+          <wp:inline distT="0" distB="0" distL="0" distR="0" wp14:anchorId="34DA9B85" wp14:editId="080F92AA">
+            <wp:extent cx="5731510" cy="4436110"/>
+            <wp:effectExtent l="0" t="0" r="2540" b="2540"/>
+            <wp:docPr id="1036213885" name="Picture 1"/>
+            <wp:cNvGraphicFramePr>
+              <a:graphicFrameLocks xmlns:a="http://schemas.openxmlformats.org/drawingml/2006/main" noChangeAspect="1"/>
+            </wp:cNvGraphicFramePr>
+            <a:graphic xmlns:a="http://schemas.openxmlformats.org/drawingml/2006/main">
+              <a:graphicData uri="http://schemas.openxmlformats.org/drawingml/2006/picture">
+                <pic:pic xmlns:pic="http://schemas.openxmlformats.org/drawingml/2006/picture">
+                  <pic:nvPicPr>
+                    <pic:cNvPr id="1036213885" name=""/>
+                    <pic:cNvPicPr/>
+                  </pic:nvPicPr>
+                  <pic:blipFill>
+                    <a:blip r:embed="rId15"/>
+                    <a:stretch>
+                      <a:fillRect/>
+                    </a:stretch>
+                  </pic:blipFill>
+                  <pic:spPr>
+                    <a:xfrm>
+                      <a:off x="0" y="0"/>
+                      <a:ext cx="5731510" cy="4436110"/>
+                    </a:xfrm>
+                    <a:prstGeom prst="rect">
+                      <a:avLst/>
+                    </a:prstGeom>
+                  </pic:spPr>
+                </pic:pic>
+              </a:graphicData>
+            </a:graphic>
+          </wp:inline>
+        </w:drawing>
       </w:r>
     </w:p>
     <w:p/>
@@ -705,11 +926,11 @@
   <w:abstractNum w:abstractNumId="1" w15:restartNumberingAfterBreak="0">
     <w:nsid w:val="0603501D"/>
     <w:multiLevelType w:val="multilevel"/>
-    <w:tmpl w:val="57D6023C"/>
+    <w:tmpl w:val="D576C59C"/>
     <w:lvl w:ilvl="0">
       <w:start w:val="1"/>
-      <w:numFmt w:val="bullet"/>
-      <w:lvlText w:val=""/>
+      <w:numFmt w:val="decimal"/>
+      <w:lvlText w:val="%1."/>
       <w:lvlJc w:val="left"/>
       <w:pPr>
         <w:tabs>
@@ -718,24 +939,20 @@
         <w:ind w:left="720" w:hanging="360"/>
       </w:pPr>
       <w:rPr>
-        <w:rFonts w:ascii="Symbol" w:hAnsi="Symbol" w:hint="default"/>
-        <w:sz w:val="20"/>
-      </w:rPr>
-    </w:lvl>
-    <w:lvl w:ilvl="1" w:tentative="1">
-      <w:start w:val="1"/>
-      <w:numFmt w:val="bullet"/>
-      <w:lvlText w:val="o"/>
-      <w:lvlJc w:val="left"/>
-      <w:pPr>
-        <w:tabs>
-          <w:tab w:val="num" w:pos="1440"/>
-        </w:tabs>
+        <w:rFonts w:hint="default"/>
+        <w:sz w:val="20"/>
+      </w:rPr>
+    </w:lvl>
+    <w:lvl w:ilvl="1">
+      <w:start w:val="1"/>
+      <w:numFmt w:val="decimal"/>
+      <w:lvlText w:val="%2."/>
+      <w:lvlJc w:val="left"/>
+      <w:pPr>
         <w:ind w:left="1440" w:hanging="360"/>
       </w:pPr>
       <w:rPr>
-        <w:rFonts w:ascii="Courier New" w:hAnsi="Courier New" w:hint="default"/>
-        <w:sz w:val="20"/>
+        <w:rFonts w:hint="default"/>
       </w:rPr>
     </w:lvl>
     <w:lvl w:ilvl="2" w:tentative="1">
@@ -1299,6 +1516,92 @@
     </w:lvl>
   </w:abstractNum>
   <w:abstractNum w:abstractNumId="5" w15:restartNumberingAfterBreak="0">
+    <w:nsid w:val="3D163F8C"/>
+    <w:multiLevelType w:val="hybridMultilevel"/>
+    <w:tmpl w:val="18364C4E"/>
+    <w:lvl w:ilvl="0" w:tplc="1C09000F">
+      <w:start w:val="1"/>
+      <w:numFmt w:val="decimal"/>
+      <w:lvlText w:val="%1."/>
+      <w:lvlJc w:val="left"/>
+      <w:pPr>
+        <w:ind w:left="1080" w:hanging="360"/>
+      </w:pPr>
+    </w:lvl>
+    <w:lvl w:ilvl="1" w:tplc="1C090019" w:tentative="1">
+      <w:start w:val="1"/>
+      <w:numFmt w:val="lowerLetter"/>
+      <w:lvlText w:val="%2."/>
+      <w:lvlJc w:val="left"/>
+      <w:pPr>
+        <w:ind w:left="1800" w:hanging="360"/>
+      </w:pPr>
+    </w:lvl>
+    <w:lvl w:ilvl="2" w:tplc="1C09001B" w:tentative="1">
+      <w:start w:val="1"/>
+      <w:numFmt w:val="lowerRoman"/>
+      <w:lvlText w:val="%3."/>
+      <w:lvlJc w:val="right"/>
+      <w:pPr>
+        <w:ind w:left="2520" w:hanging="180"/>
+      </w:pPr>
+    </w:lvl>
+    <w:lvl w:ilvl="3" w:tplc="1C09000F" w:tentative="1">
+      <w:start w:val="1"/>
+      <w:numFmt w:val="decimal"/>
+      <w:lvlText w:val="%4."/>
+      <w:lvlJc w:val="left"/>
+      <w:pPr>
+        <w:ind w:left="3240" w:hanging="360"/>
+      </w:pPr>
+    </w:lvl>
+    <w:lvl w:ilvl="4" w:tplc="1C090019" w:tentative="1">
+      <w:start w:val="1"/>
+      <w:numFmt w:val="lowerLetter"/>
+      <w:lvlText w:val="%5."/>
+      <w:lvlJc w:val="left"/>
+      <w:pPr>
+        <w:ind w:left="3960" w:hanging="360"/>
+      </w:pPr>
+    </w:lvl>
+    <w:lvl w:ilvl="5" w:tplc="1C09001B" w:tentative="1">
+      <w:start w:val="1"/>
+      <w:numFmt w:val="lowerRoman"/>
+      <w:lvlText w:val="%6."/>
+      <w:lvlJc w:val="right"/>
+      <w:pPr>
+        <w:ind w:left="4680" w:hanging="180"/>
+      </w:pPr>
+    </w:lvl>
+    <w:lvl w:ilvl="6" w:tplc="1C09000F" w:tentative="1">
+      <w:start w:val="1"/>
+      <w:numFmt w:val="decimal"/>
+      <w:lvlText w:val="%7."/>
+      <w:lvlJc w:val="left"/>
+      <w:pPr>
+        <w:ind w:left="5400" w:hanging="360"/>
+      </w:pPr>
+    </w:lvl>
+    <w:lvl w:ilvl="7" w:tplc="1C090019" w:tentative="1">
+      <w:start w:val="1"/>
+      <w:numFmt w:val="lowerLetter"/>
+      <w:lvlText w:val="%8."/>
+      <w:lvlJc w:val="left"/>
+      <w:pPr>
+        <w:ind w:left="6120" w:hanging="360"/>
+      </w:pPr>
+    </w:lvl>
+    <w:lvl w:ilvl="8" w:tplc="1C09001B" w:tentative="1">
+      <w:start w:val="1"/>
+      <w:numFmt w:val="lowerRoman"/>
+      <w:lvlText w:val="%9."/>
+      <w:lvlJc w:val="right"/>
+      <w:pPr>
+        <w:ind w:left="6840" w:hanging="180"/>
+      </w:pPr>
+    </w:lvl>
+  </w:abstractNum>
+  <w:abstractNum w:abstractNumId="6" w15:restartNumberingAfterBreak="0">
     <w:nsid w:val="72D938B5"/>
     <w:multiLevelType w:val="multilevel"/>
     <w:tmpl w:val="82A0B812"/>
@@ -1460,10 +1763,13 @@
     <w:abstractNumId w:val="0"/>
   </w:num>
   <w:num w:numId="5" w16cid:durableId="537669584">
-    <w:abstractNumId w:val="5"/>
+    <w:abstractNumId w:val="6"/>
   </w:num>
   <w:num w:numId="6" w16cid:durableId="334038292">
     <w:abstractNumId w:val="1"/>
+  </w:num>
+  <w:num w:numId="7" w16cid:durableId="446505053">
+    <w:abstractNumId w:val="5"/>
   </w:num>
 </w:numbering>
 </file>
@@ -2071,6 +2377,7 @@
   <w:style w:type="character" w:default="1" w:styleId="DefaultParagraphFont">
     <w:name w:val="Default Paragraph Font"/>
     <w:uiPriority w:val="1"/>
+    <w:semiHidden/>
     <w:unhideWhenUsed/>
   </w:style>
   <w:style w:type="table" w:default="1" w:styleId="TableNormal">

</xml_diff>

<commit_message>
Feat: Expanded on the Functional test's
</commit_message>
<xml_diff>
--- a/Functional Tests.docx
+++ b/Functional Tests.docx
@@ -104,7 +104,15 @@
     </w:p>
     <w:p>
       <w:r>
-        <w:t>Test the minimum pulse width the analyzer can detect. [</w:t>
+        <w:t xml:space="preserve">Test the minimum pulse width the </w:t>
+      </w:r>
+      <w:proofErr w:type="spellStart"/>
+      <w:r>
+        <w:t>analyzer</w:t>
+      </w:r>
+      <w:proofErr w:type="spellEnd"/>
+      <w:r>
+        <w:t xml:space="preserve"> can detect. [</w:t>
       </w:r>
       <w:hyperlink r:id="rId6" w:history="1">
         <w:r>
@@ -274,7 +282,15 @@
     </w:p>
     <w:p>
       <w:r>
-        <w:t>Ensure the analyzer starts recording exactly when the trigger condition is met. [</w:t>
+        <w:t xml:space="preserve">Ensure the </w:t>
+      </w:r>
+      <w:proofErr w:type="spellStart"/>
+      <w:r>
+        <w:t>analyzer</w:t>
+      </w:r>
+      <w:proofErr w:type="spellEnd"/>
+      <w:r>
+        <w:t xml:space="preserve"> starts recording exactly when the trigger condition is met. [</w:t>
       </w:r>
       <w:hyperlink r:id="rId8" w:history="1">
         <w:r>
@@ -562,6 +578,9 @@
     </w:p>
     <w:p>
       <w:r>
+        <w:rPr>
+          <w:noProof/>
+        </w:rPr>
         <w:drawing>
           <wp:inline distT="0" distB="0" distL="0" distR="0" wp14:anchorId="662CCDE0" wp14:editId="0AE60625">
             <wp:extent cx="5731510" cy="2959100"/>
@@ -723,6 +742,9 @@
     </w:p>
     <w:p>
       <w:r>
+        <w:rPr>
+          <w:noProof/>
+        </w:rPr>
         <w:lastRenderedPageBreak/>
         <w:drawing>
           <wp:inline distT="0" distB="0" distL="0" distR="0" wp14:anchorId="34DA9B85" wp14:editId="080F92AA">
@@ -761,6 +783,741 @@
         </w:drawing>
       </w:r>
     </w:p>
+    <w:p>
+      <w:pPr>
+        <w:rPr>
+          <w:b/>
+          <w:bCs/>
+        </w:rPr>
+      </w:pPr>
+      <w:r>
+        <w:rPr>
+          <w:rFonts w:ascii="Segoe UI Emoji" w:hAnsi="Segoe UI Emoji" w:cs="Segoe UI Emoji"/>
+          <w:b/>
+          <w:bCs/>
+        </w:rPr>
+        <w:t>⏱️</w:t>
+      </w:r>
+      <w:r>
+        <w:rPr>
+          <w:b/>
+          <w:bCs/>
+        </w:rPr>
+        <w:t xml:space="preserve"> Sampling &amp; Frequency Tests</w:t>
+      </w:r>
+    </w:p>
+    <w:p>
+      <w:pPr>
+        <w:numPr>
+          <w:ilvl w:val="0"/>
+          <w:numId w:val="8"/>
+        </w:numPr>
+      </w:pPr>
+      <w:r>
+        <w:rPr>
+          <w:b/>
+          <w:bCs/>
+        </w:rPr>
+        <w:t>Maximum Sampling Rate (Buffer):</w:t>
+      </w:r>
+    </w:p>
+    <w:p>
+      <w:pPr>
+        <w:numPr>
+          <w:ilvl w:val="1"/>
+          <w:numId w:val="8"/>
+        </w:numPr>
+      </w:pPr>
+      <w:r>
+        <w:rPr>
+          <w:b/>
+          <w:bCs/>
+        </w:rPr>
+        <w:t>Test:</w:t>
+      </w:r>
+      <w:r>
+        <w:t xml:space="preserve"> Generate a high-speed clock signal (e.g., 50MHz for DL16, 200MHz for Plus).</w:t>
+      </w:r>
+    </w:p>
+    <w:p>
+      <w:pPr>
+        <w:numPr>
+          <w:ilvl w:val="1"/>
+          <w:numId w:val="8"/>
+        </w:numPr>
+      </w:pPr>
+      <w:r>
+        <w:rPr>
+          <w:b/>
+          <w:bCs/>
+        </w:rPr>
+        <w:t>Validation:</w:t>
+      </w:r>
+      <w:r>
+        <w:t xml:space="preserve"> Use the </w:t>
+      </w:r>
+      <w:hyperlink r:id="rId16" w:tgtFrame="_blank" w:history="1">
+        <w:r>
+          <w:rPr>
+            <w:rStyle w:val="Hyperlink"/>
+          </w:rPr>
+          <w:t>Nyquist–Shannon sampling theorem</w:t>
+        </w:r>
+      </w:hyperlink>
+      <w:r>
+        <w:t xml:space="preserve"> as a guide. Your </w:t>
+      </w:r>
+      <w:proofErr w:type="spellStart"/>
+      <w:r>
+        <w:t>analyzer</w:t>
+      </w:r>
+      <w:proofErr w:type="spellEnd"/>
+      <w:r>
+        <w:t xml:space="preserve"> should sample at least </w:t>
+      </w:r>
+      <w:r>
+        <w:rPr>
+          <w:b/>
+          <w:bCs/>
+        </w:rPr>
+        <w:t>4x to 5x</w:t>
+      </w:r>
+      <w:r>
+        <w:t xml:space="preserve"> the signal frequency to accurately reconstruct it. If a 50MHz signal looks like a random mess or a much slower clock, you've hit an aliasing limit.</w:t>
+      </w:r>
+    </w:p>
+    <w:p>
+      <w:pPr>
+        <w:numPr>
+          <w:ilvl w:val="0"/>
+          <w:numId w:val="8"/>
+        </w:numPr>
+      </w:pPr>
+      <w:r>
+        <w:rPr>
+          <w:b/>
+          <w:bCs/>
+        </w:rPr>
+        <w:t>Minimum Detectable Pulse Width:</w:t>
+      </w:r>
+    </w:p>
+    <w:p>
+      <w:pPr>
+        <w:numPr>
+          <w:ilvl w:val="1"/>
+          <w:numId w:val="8"/>
+        </w:numPr>
+      </w:pPr>
+      <w:r>
+        <w:rPr>
+          <w:b/>
+          <w:bCs/>
+        </w:rPr>
+        <w:t>Test:</w:t>
+      </w:r>
+      <w:r>
+        <w:t xml:space="preserve"> Create a very narrow pulse (glitch) using a PWM generator. Gradually decrease the width from 20ns down to your target (8ns or 2ns).</w:t>
+      </w:r>
+    </w:p>
+    <w:p>
+      <w:pPr>
+        <w:numPr>
+          <w:ilvl w:val="1"/>
+          <w:numId w:val="8"/>
+        </w:numPr>
+      </w:pPr>
+      <w:r>
+        <w:rPr>
+          <w:b/>
+          <w:bCs/>
+        </w:rPr>
+        <w:t>Validation:</w:t>
+      </w:r>
+      <w:r>
+        <w:t xml:space="preserve"> The </w:t>
+      </w:r>
+      <w:proofErr w:type="spellStart"/>
+      <w:r>
+        <w:t>analyzer</w:t>
+      </w:r>
+      <w:proofErr w:type="spellEnd"/>
+      <w:r>
+        <w:t xml:space="preserve"> "validates" this if it can consistently trigger on and display the pulse without it disappearing between samples. [</w:t>
+      </w:r>
+      <w:hyperlink r:id="rId17" w:history="1">
+        <w:r>
+          <w:rPr>
+            <w:rStyle w:val="Hyperlink"/>
+          </w:rPr>
+          <w:t>1</w:t>
+        </w:r>
+      </w:hyperlink>
+      <w:r>
+        <w:t xml:space="preserve">, </w:t>
+      </w:r>
+      <w:hyperlink r:id="rId18" w:history="1">
+        <w:r>
+          <w:rPr>
+            <w:rStyle w:val="Hyperlink"/>
+          </w:rPr>
+          <w:t>2</w:t>
+        </w:r>
+      </w:hyperlink>
+      <w:r>
+        <w:t xml:space="preserve">, </w:t>
+      </w:r>
+      <w:hyperlink r:id="rId19" w:history="1">
+        <w:r>
+          <w:rPr>
+            <w:rStyle w:val="Hyperlink"/>
+          </w:rPr>
+          <w:t>3</w:t>
+        </w:r>
+      </w:hyperlink>
+      <w:r>
+        <w:t>]</w:t>
+      </w:r>
+    </w:p>
+    <w:p>
+      <w:r>
+        <w:pict w14:anchorId="07109797">
+          <v:rect id="_x0000_i1043" style="width:0;height:1.5pt" o:hralign="center" o:hrstd="t" o:hr="t" fillcolor="#a0a0a0" stroked="f"/>
+        </w:pict>
+      </w:r>
+    </w:p>
+    <w:p>
+      <w:pPr>
+        <w:rPr>
+          <w:b/>
+          <w:bCs/>
+        </w:rPr>
+      </w:pPr>
+      <w:r>
+        <w:rPr>
+          <w:rFonts w:ascii="Segoe UI Emoji" w:hAnsi="Segoe UI Emoji" w:cs="Segoe UI Emoji"/>
+          <w:b/>
+          <w:bCs/>
+        </w:rPr>
+        <w:t>💾</w:t>
+      </w:r>
+      <w:r>
+        <w:rPr>
+          <w:b/>
+          <w:bCs/>
+        </w:rPr>
+        <w:t xml:space="preserve"> Storage &amp; Data Mode Tests</w:t>
+      </w:r>
+    </w:p>
+    <w:p>
+      <w:pPr>
+        <w:numPr>
+          <w:ilvl w:val="0"/>
+          <w:numId w:val="9"/>
+        </w:numPr>
+      </w:pPr>
+      <w:r>
+        <w:rPr>
+          <w:b/>
+          <w:bCs/>
+        </w:rPr>
+        <w:lastRenderedPageBreak/>
+        <w:t>Hardware Storage Depth:</w:t>
+      </w:r>
+    </w:p>
+    <w:p>
+      <w:pPr>
+        <w:numPr>
+          <w:ilvl w:val="1"/>
+          <w:numId w:val="9"/>
+        </w:numPr>
+      </w:pPr>
+      <w:r>
+        <w:rPr>
+          <w:b/>
+          <w:bCs/>
+        </w:rPr>
+        <w:t>Test:</w:t>
+      </w:r>
+      <w:r>
+        <w:t xml:space="preserve"> Set the </w:t>
+      </w:r>
+      <w:proofErr w:type="spellStart"/>
+      <w:r>
+        <w:t>analyzer</w:t>
+      </w:r>
+      <w:proofErr w:type="spellEnd"/>
+      <w:r>
+        <w:t xml:space="preserve"> to its maximum sampling rate and trigger a long, continuous data stream (like a fast UART or SPI burst).</w:t>
+      </w:r>
+    </w:p>
+    <w:p>
+      <w:pPr>
+        <w:numPr>
+          <w:ilvl w:val="1"/>
+          <w:numId w:val="9"/>
+        </w:numPr>
+      </w:pPr>
+      <w:r>
+        <w:rPr>
+          <w:b/>
+          <w:bCs/>
+        </w:rPr>
+        <w:t>Validation:</w:t>
+      </w:r>
+      <w:r>
+        <w:t xml:space="preserve"> Calculate the expected time: (Total Bits) / (Sample Rate * Channels). If you have 1Gbit of storage and sample 16 channels at 100MHz, you should capture about </w:t>
+      </w:r>
+      <w:r>
+        <w:rPr>
+          <w:b/>
+          <w:bCs/>
+        </w:rPr>
+        <w:t>0.625 seconds</w:t>
+      </w:r>
+      <w:r>
+        <w:t xml:space="preserve"> of data. If it stops early, your buffer management or RLE compression is failing.</w:t>
+      </w:r>
+    </w:p>
+    <w:p>
+      <w:pPr>
+        <w:numPr>
+          <w:ilvl w:val="0"/>
+          <w:numId w:val="9"/>
+        </w:numPr>
+      </w:pPr>
+      <w:r>
+        <w:rPr>
+          <w:b/>
+          <w:bCs/>
+        </w:rPr>
+        <w:t>Stream Mode (Computer Memory):</w:t>
+      </w:r>
+    </w:p>
+    <w:p>
+      <w:pPr>
+        <w:numPr>
+          <w:ilvl w:val="1"/>
+          <w:numId w:val="9"/>
+        </w:numPr>
+      </w:pPr>
+      <w:r>
+        <w:rPr>
+          <w:b/>
+          <w:bCs/>
+        </w:rPr>
+        <w:t>Test:</w:t>
+      </w:r>
+      <w:r>
+        <w:t xml:space="preserve"> Set a lower sample rate (e.g., 20MHz) and record for several minutes.</w:t>
+      </w:r>
+    </w:p>
+    <w:p>
+      <w:pPr>
+        <w:numPr>
+          <w:ilvl w:val="1"/>
+          <w:numId w:val="9"/>
+        </w:numPr>
+      </w:pPr>
+      <w:r>
+        <w:rPr>
+          <w:b/>
+          <w:bCs/>
+        </w:rPr>
+        <w:t>Validation:</w:t>
+      </w:r>
+      <w:r>
+        <w:t xml:space="preserve"> Monitor your PC's RAM usage. The </w:t>
+      </w:r>
+      <w:proofErr w:type="spellStart"/>
+      <w:r>
+        <w:t>analyzer</w:t>
+      </w:r>
+      <w:proofErr w:type="spellEnd"/>
+      <w:r>
+        <w:t xml:space="preserve"> should continuously "stream" data over USB without dropping samples or crashing the software. [</w:t>
+      </w:r>
+      <w:hyperlink r:id="rId20" w:history="1">
+        <w:r>
+          <w:rPr>
+            <w:rStyle w:val="Hyperlink"/>
+          </w:rPr>
+          <w:t>1</w:t>
+        </w:r>
+      </w:hyperlink>
+      <w:r>
+        <w:t>]</w:t>
+      </w:r>
+    </w:p>
+    <w:p>
+      <w:r>
+        <w:pict w14:anchorId="22943C5F">
+          <v:rect id="_x0000_i1044" style="width:0;height:1.5pt" o:hralign="center" o:hrstd="t" o:hr="t" fillcolor="#a0a0a0" stroked="f"/>
+        </w:pict>
+      </w:r>
+    </w:p>
+    <w:p>
+      <w:pPr>
+        <w:rPr>
+          <w:b/>
+          <w:bCs/>
+        </w:rPr>
+      </w:pPr>
+      <w:r>
+        <w:rPr>
+          <w:rFonts w:ascii="Segoe UI Emoji" w:hAnsi="Segoe UI Emoji" w:cs="Segoe UI Emoji"/>
+          <w:b/>
+          <w:bCs/>
+        </w:rPr>
+        <w:t>⚡</w:t>
+      </w:r>
+      <w:r>
+        <w:rPr>
+          <w:b/>
+          <w:bCs/>
+        </w:rPr>
+        <w:t xml:space="preserve"> Electrical &amp; Signal Integrity</w:t>
+      </w:r>
+    </w:p>
+    <w:p>
+      <w:pPr>
+        <w:numPr>
+          <w:ilvl w:val="0"/>
+          <w:numId w:val="10"/>
+        </w:numPr>
+      </w:pPr>
+      <w:r>
+        <w:rPr>
+          <w:b/>
+          <w:bCs/>
+        </w:rPr>
+        <w:t>Input Impedance (250kΩ/15pF):</w:t>
+      </w:r>
+    </w:p>
+    <w:p>
+      <w:pPr>
+        <w:numPr>
+          <w:ilvl w:val="1"/>
+          <w:numId w:val="10"/>
+        </w:numPr>
+      </w:pPr>
+      <w:r>
+        <w:rPr>
+          <w:b/>
+          <w:bCs/>
+        </w:rPr>
+        <w:t>Test:</w:t>
+      </w:r>
+      <w:r>
+        <w:t xml:space="preserve"> Connect a 100kΩ resistor in series with your signal source and the </w:t>
+      </w:r>
+      <w:proofErr w:type="spellStart"/>
+      <w:r>
+        <w:t>analyzer</w:t>
+      </w:r>
+      <w:proofErr w:type="spellEnd"/>
+      <w:r>
+        <w:t xml:space="preserve"> input.</w:t>
+      </w:r>
+    </w:p>
+    <w:p>
+      <w:pPr>
+        <w:numPr>
+          <w:ilvl w:val="1"/>
+          <w:numId w:val="10"/>
+        </w:numPr>
+      </w:pPr>
+      <w:r>
+        <w:rPr>
+          <w:b/>
+          <w:bCs/>
+        </w:rPr>
+        <w:t>Validation:</w:t>
+      </w:r>
+      <w:r>
+        <w:t xml:space="preserve"> Measure the voltage at the </w:t>
+      </w:r>
+      <w:proofErr w:type="spellStart"/>
+      <w:r>
+        <w:t>analyzer's</w:t>
+      </w:r>
+      <w:proofErr w:type="spellEnd"/>
+      <w:r>
+        <w:t xml:space="preserve"> pin with a high-impedance scope. If the voltage drops significantly, your input impedance is too low, which will "load" and distort the circuit you are testing.</w:t>
+      </w:r>
+    </w:p>
+    <w:p>
+      <w:pPr>
+        <w:numPr>
+          <w:ilvl w:val="0"/>
+          <w:numId w:val="10"/>
+        </w:numPr>
+      </w:pPr>
+      <w:r>
+        <w:rPr>
+          <w:b/>
+          <w:bCs/>
+        </w:rPr>
+        <w:t>Adjustable Threshold:</w:t>
+      </w:r>
+    </w:p>
+    <w:p>
+      <w:pPr>
+        <w:numPr>
+          <w:ilvl w:val="1"/>
+          <w:numId w:val="10"/>
+        </w:numPr>
+      </w:pPr>
+      <w:r>
+        <w:rPr>
+          <w:b/>
+          <w:bCs/>
+        </w:rPr>
+        <w:t>Test:</w:t>
+      </w:r>
+      <w:r>
+        <w:t xml:space="preserve"> Feed a 3.3V signal into the </w:t>
+      </w:r>
+      <w:proofErr w:type="spellStart"/>
+      <w:r>
+        <w:t>analyzer</w:t>
+      </w:r>
+      <w:proofErr w:type="spellEnd"/>
+      <w:r>
+        <w:t>. Set your threshold to 1.0V, then 2.5V, then 3.0V.</w:t>
+      </w:r>
+    </w:p>
+    <w:p>
+      <w:pPr>
+        <w:numPr>
+          <w:ilvl w:val="1"/>
+          <w:numId w:val="10"/>
+        </w:numPr>
+      </w:pPr>
+      <w:r>
+        <w:rPr>
+          <w:b/>
+          <w:bCs/>
+        </w:rPr>
+        <w:t>Validation:</w:t>
+      </w:r>
+      <w:r>
+        <w:t xml:space="preserve"> At 1.0V, the signal should look normal. At 3.0V, it should either show as a constant "Low" or be highly jittery, confirming the threshold is </w:t>
+      </w:r>
+      <w:proofErr w:type="gramStart"/>
+      <w:r>
+        <w:t>actually moving</w:t>
+      </w:r>
+      <w:proofErr w:type="gramEnd"/>
+      <w:r>
+        <w:t>. [</w:t>
+      </w:r>
+      <w:hyperlink r:id="rId21" w:history="1">
+        <w:r>
+          <w:rPr>
+            <w:rStyle w:val="Hyperlink"/>
+          </w:rPr>
+          <w:t>1</w:t>
+        </w:r>
+      </w:hyperlink>
+      <w:r>
+        <w:t xml:space="preserve">, </w:t>
+      </w:r>
+      <w:hyperlink r:id="rId22" w:history="1">
+        <w:r>
+          <w:rPr>
+            <w:rStyle w:val="Hyperlink"/>
+          </w:rPr>
+          <w:t>2</w:t>
+        </w:r>
+      </w:hyperlink>
+      <w:r>
+        <w:t xml:space="preserve">, </w:t>
+      </w:r>
+      <w:hyperlink r:id="rId23" w:history="1">
+        <w:r>
+          <w:rPr>
+            <w:rStyle w:val="Hyperlink"/>
+          </w:rPr>
+          <w:t>3</w:t>
+        </w:r>
+      </w:hyperlink>
+      <w:r>
+        <w:t>]</w:t>
+      </w:r>
+    </w:p>
+    <w:p>
+      <w:r>
+        <w:pict w14:anchorId="2BDCCB0D">
+          <v:rect id="_x0000_i1045" style="width:0;height:1.5pt" o:hralign="center" o:hrstd="t" o:hr="t" fillcolor="#a0a0a0" stroked="f"/>
+        </w:pict>
+      </w:r>
+    </w:p>
+    <w:p>
+      <w:pPr>
+        <w:rPr>
+          <w:b/>
+          <w:bCs/>
+        </w:rPr>
+      </w:pPr>
+      <w:r>
+        <w:rPr>
+          <w:rFonts w:ascii="Segoe UI Emoji" w:hAnsi="Segoe UI Emoji" w:cs="Segoe UI Emoji"/>
+          <w:b/>
+          <w:bCs/>
+        </w:rPr>
+        <w:t>🔍</w:t>
+      </w:r>
+      <w:r>
+        <w:rPr>
+          <w:b/>
+          <w:bCs/>
+        </w:rPr>
+        <w:t xml:space="preserve"> Protocol &amp; Triggering</w:t>
+      </w:r>
+    </w:p>
+    <w:p>
+      <w:pPr>
+        <w:numPr>
+          <w:ilvl w:val="0"/>
+          <w:numId w:val="11"/>
+        </w:numPr>
+      </w:pPr>
+      <w:r>
+        <w:rPr>
+          <w:b/>
+          <w:bCs/>
+        </w:rPr>
+        <w:t>Trigger Accuracy:</w:t>
+      </w:r>
+    </w:p>
+    <w:p>
+      <w:pPr>
+        <w:numPr>
+          <w:ilvl w:val="1"/>
+          <w:numId w:val="11"/>
+        </w:numPr>
+      </w:pPr>
+      <w:r>
+        <w:rPr>
+          <w:b/>
+          <w:bCs/>
+        </w:rPr>
+        <w:t>Test:</w:t>
+      </w:r>
+      <w:r>
+        <w:t xml:space="preserve"> Set a "Falling Edge" trigger on a specific pin and a "Value" trigger on a protocol (e.g., trigger when I2C address 0x42 appears).</w:t>
+      </w:r>
+    </w:p>
+    <w:p>
+      <w:pPr>
+        <w:numPr>
+          <w:ilvl w:val="1"/>
+          <w:numId w:val="11"/>
+        </w:numPr>
+      </w:pPr>
+      <w:r>
+        <w:rPr>
+          <w:b/>
+          <w:bCs/>
+        </w:rPr>
+        <w:lastRenderedPageBreak/>
+        <w:t>Validation:</w:t>
+      </w:r>
+      <w:r>
+        <w:t xml:space="preserve"> The capture should start </w:t>
+      </w:r>
+      <w:r>
+        <w:rPr>
+          <w:i/>
+          <w:iCs/>
+        </w:rPr>
+        <w:t>exactly</w:t>
+      </w:r>
+      <w:r>
+        <w:t xml:space="preserve"> at that event. If the data starts 10ms after the event, your trigger logic has a </w:t>
+      </w:r>
+      <w:hyperlink r:id="rId24" w:tgtFrame="_blank" w:history="1">
+        <w:r>
+          <w:rPr>
+            <w:rStyle w:val="Hyperlink"/>
+          </w:rPr>
+          <w:t>timing violation or latency issue</w:t>
+        </w:r>
+      </w:hyperlink>
+      <w:r>
+        <w:t>.</w:t>
+      </w:r>
+    </w:p>
+    <w:p>
+      <w:pPr>
+        <w:numPr>
+          <w:ilvl w:val="0"/>
+          <w:numId w:val="11"/>
+        </w:numPr>
+      </w:pPr>
+      <w:r>
+        <w:rPr>
+          <w:b/>
+          <w:bCs/>
+        </w:rPr>
+        <w:t>Protocol Decoding (170+):</w:t>
+      </w:r>
+    </w:p>
+    <w:p>
+      <w:pPr>
+        <w:numPr>
+          <w:ilvl w:val="1"/>
+          <w:numId w:val="11"/>
+        </w:numPr>
+      </w:pPr>
+      <w:r>
+        <w:rPr>
+          <w:b/>
+          <w:bCs/>
+        </w:rPr>
+        <w:t>Test:</w:t>
+      </w:r>
+      <w:r>
+        <w:t xml:space="preserve"> Use a known-good device (like an </w:t>
+      </w:r>
+      <w:hyperlink r:id="rId25" w:tgtFrame="_blank" w:history="1">
+        <w:r>
+          <w:rPr>
+            <w:rStyle w:val="Hyperlink"/>
+          </w:rPr>
+          <w:t>Arduino</w:t>
+        </w:r>
+      </w:hyperlink>
+      <w:r>
+        <w:t xml:space="preserve"> or Raspberry Pi) to send standard UART, I2C, and SPI messages.</w:t>
+      </w:r>
+    </w:p>
+    <w:p>
+      <w:pPr>
+        <w:numPr>
+          <w:ilvl w:val="1"/>
+          <w:numId w:val="11"/>
+        </w:numPr>
+      </w:pPr>
+      <w:r>
+        <w:rPr>
+          <w:b/>
+          <w:bCs/>
+        </w:rPr>
+        <w:t>Validation:</w:t>
+      </w:r>
+      <w:r>
+        <w:t xml:space="preserve"> Compare the </w:t>
+      </w:r>
+      <w:proofErr w:type="spellStart"/>
+      <w:r>
+        <w:t>analyzer's</w:t>
+      </w:r>
+      <w:proofErr w:type="spellEnd"/>
+      <w:r>
+        <w:t xml:space="preserve"> decoded text/hex output to the code you wrote. Any mismatch indicates a sampling jitter or decoding software bug</w:t>
+      </w:r>
+    </w:p>
     <w:p/>
     <w:sectPr>
       <w:pgSz w:w="11906" w:h="16838"/>
@@ -1218,6 +1975,155 @@
     </w:lvl>
   </w:abstractNum>
   <w:abstractNum w:abstractNumId="3" w15:restartNumberingAfterBreak="0">
+    <w:nsid w:val="282B2CF1"/>
+    <w:multiLevelType w:val="multilevel"/>
+    <w:tmpl w:val="CD526C18"/>
+    <w:lvl w:ilvl="0">
+      <w:start w:val="1"/>
+      <w:numFmt w:val="bullet"/>
+      <w:lvlText w:val=""/>
+      <w:lvlJc w:val="left"/>
+      <w:pPr>
+        <w:tabs>
+          <w:tab w:val="num" w:pos="720"/>
+        </w:tabs>
+        <w:ind w:left="720" w:hanging="360"/>
+      </w:pPr>
+      <w:rPr>
+        <w:rFonts w:ascii="Symbol" w:hAnsi="Symbol" w:hint="default"/>
+        <w:sz w:val="20"/>
+      </w:rPr>
+    </w:lvl>
+    <w:lvl w:ilvl="1">
+      <w:start w:val="1"/>
+      <w:numFmt w:val="bullet"/>
+      <w:lvlText w:val="o"/>
+      <w:lvlJc w:val="left"/>
+      <w:pPr>
+        <w:tabs>
+          <w:tab w:val="num" w:pos="1440"/>
+        </w:tabs>
+        <w:ind w:left="1440" w:hanging="360"/>
+      </w:pPr>
+      <w:rPr>
+        <w:rFonts w:ascii="Courier New" w:hAnsi="Courier New" w:hint="default"/>
+        <w:sz w:val="20"/>
+      </w:rPr>
+    </w:lvl>
+    <w:lvl w:ilvl="2" w:tentative="1">
+      <w:start w:val="1"/>
+      <w:numFmt w:val="bullet"/>
+      <w:lvlText w:val=""/>
+      <w:lvlJc w:val="left"/>
+      <w:pPr>
+        <w:tabs>
+          <w:tab w:val="num" w:pos="2160"/>
+        </w:tabs>
+        <w:ind w:left="2160" w:hanging="360"/>
+      </w:pPr>
+      <w:rPr>
+        <w:rFonts w:ascii="Wingdings" w:hAnsi="Wingdings" w:hint="default"/>
+        <w:sz w:val="20"/>
+      </w:rPr>
+    </w:lvl>
+    <w:lvl w:ilvl="3" w:tentative="1">
+      <w:start w:val="1"/>
+      <w:numFmt w:val="bullet"/>
+      <w:lvlText w:val=""/>
+      <w:lvlJc w:val="left"/>
+      <w:pPr>
+        <w:tabs>
+          <w:tab w:val="num" w:pos="2880"/>
+        </w:tabs>
+        <w:ind w:left="2880" w:hanging="360"/>
+      </w:pPr>
+      <w:rPr>
+        <w:rFonts w:ascii="Wingdings" w:hAnsi="Wingdings" w:hint="default"/>
+        <w:sz w:val="20"/>
+      </w:rPr>
+    </w:lvl>
+    <w:lvl w:ilvl="4" w:tentative="1">
+      <w:start w:val="1"/>
+      <w:numFmt w:val="bullet"/>
+      <w:lvlText w:val=""/>
+      <w:lvlJc w:val="left"/>
+      <w:pPr>
+        <w:tabs>
+          <w:tab w:val="num" w:pos="3600"/>
+        </w:tabs>
+        <w:ind w:left="3600" w:hanging="360"/>
+      </w:pPr>
+      <w:rPr>
+        <w:rFonts w:ascii="Wingdings" w:hAnsi="Wingdings" w:hint="default"/>
+        <w:sz w:val="20"/>
+      </w:rPr>
+    </w:lvl>
+    <w:lvl w:ilvl="5" w:tentative="1">
+      <w:start w:val="1"/>
+      <w:numFmt w:val="bullet"/>
+      <w:lvlText w:val=""/>
+      <w:lvlJc w:val="left"/>
+      <w:pPr>
+        <w:tabs>
+          <w:tab w:val="num" w:pos="4320"/>
+        </w:tabs>
+        <w:ind w:left="4320" w:hanging="360"/>
+      </w:pPr>
+      <w:rPr>
+        <w:rFonts w:ascii="Wingdings" w:hAnsi="Wingdings" w:hint="default"/>
+        <w:sz w:val="20"/>
+      </w:rPr>
+    </w:lvl>
+    <w:lvl w:ilvl="6" w:tentative="1">
+      <w:start w:val="1"/>
+      <w:numFmt w:val="bullet"/>
+      <w:lvlText w:val=""/>
+      <w:lvlJc w:val="left"/>
+      <w:pPr>
+        <w:tabs>
+          <w:tab w:val="num" w:pos="5040"/>
+        </w:tabs>
+        <w:ind w:left="5040" w:hanging="360"/>
+      </w:pPr>
+      <w:rPr>
+        <w:rFonts w:ascii="Wingdings" w:hAnsi="Wingdings" w:hint="default"/>
+        <w:sz w:val="20"/>
+      </w:rPr>
+    </w:lvl>
+    <w:lvl w:ilvl="7" w:tentative="1">
+      <w:start w:val="1"/>
+      <w:numFmt w:val="bullet"/>
+      <w:lvlText w:val=""/>
+      <w:lvlJc w:val="left"/>
+      <w:pPr>
+        <w:tabs>
+          <w:tab w:val="num" w:pos="5760"/>
+        </w:tabs>
+        <w:ind w:left="5760" w:hanging="360"/>
+      </w:pPr>
+      <w:rPr>
+        <w:rFonts w:ascii="Wingdings" w:hAnsi="Wingdings" w:hint="default"/>
+        <w:sz w:val="20"/>
+      </w:rPr>
+    </w:lvl>
+    <w:lvl w:ilvl="8" w:tentative="1">
+      <w:start w:val="1"/>
+      <w:numFmt w:val="bullet"/>
+      <w:lvlText w:val=""/>
+      <w:lvlJc w:val="left"/>
+      <w:pPr>
+        <w:tabs>
+          <w:tab w:val="num" w:pos="6480"/>
+        </w:tabs>
+        <w:ind w:left="6480" w:hanging="360"/>
+      </w:pPr>
+      <w:rPr>
+        <w:rFonts w:ascii="Wingdings" w:hAnsi="Wingdings" w:hint="default"/>
+        <w:sz w:val="20"/>
+      </w:rPr>
+    </w:lvl>
+  </w:abstractNum>
+  <w:abstractNum w:abstractNumId="4" w15:restartNumberingAfterBreak="0">
     <w:nsid w:val="29D4621C"/>
     <w:multiLevelType w:val="multilevel"/>
     <w:tmpl w:val="3AFE881E"/>
@@ -1366,7 +2272,156 @@
       </w:rPr>
     </w:lvl>
   </w:abstractNum>
-  <w:abstractNum w:abstractNumId="4" w15:restartNumberingAfterBreak="0">
+  <w:abstractNum w:abstractNumId="5" w15:restartNumberingAfterBreak="0">
+    <w:nsid w:val="33A9225B"/>
+    <w:multiLevelType w:val="multilevel"/>
+    <w:tmpl w:val="6D76D1BC"/>
+    <w:lvl w:ilvl="0">
+      <w:start w:val="1"/>
+      <w:numFmt w:val="bullet"/>
+      <w:lvlText w:val=""/>
+      <w:lvlJc w:val="left"/>
+      <w:pPr>
+        <w:tabs>
+          <w:tab w:val="num" w:pos="720"/>
+        </w:tabs>
+        <w:ind w:left="720" w:hanging="360"/>
+      </w:pPr>
+      <w:rPr>
+        <w:rFonts w:ascii="Symbol" w:hAnsi="Symbol" w:hint="default"/>
+        <w:sz w:val="20"/>
+      </w:rPr>
+    </w:lvl>
+    <w:lvl w:ilvl="1">
+      <w:start w:val="1"/>
+      <w:numFmt w:val="bullet"/>
+      <w:lvlText w:val="o"/>
+      <w:lvlJc w:val="left"/>
+      <w:pPr>
+        <w:tabs>
+          <w:tab w:val="num" w:pos="1440"/>
+        </w:tabs>
+        <w:ind w:left="1440" w:hanging="360"/>
+      </w:pPr>
+      <w:rPr>
+        <w:rFonts w:ascii="Courier New" w:hAnsi="Courier New" w:hint="default"/>
+        <w:sz w:val="20"/>
+      </w:rPr>
+    </w:lvl>
+    <w:lvl w:ilvl="2" w:tentative="1">
+      <w:start w:val="1"/>
+      <w:numFmt w:val="bullet"/>
+      <w:lvlText w:val=""/>
+      <w:lvlJc w:val="left"/>
+      <w:pPr>
+        <w:tabs>
+          <w:tab w:val="num" w:pos="2160"/>
+        </w:tabs>
+        <w:ind w:left="2160" w:hanging="360"/>
+      </w:pPr>
+      <w:rPr>
+        <w:rFonts w:ascii="Wingdings" w:hAnsi="Wingdings" w:hint="default"/>
+        <w:sz w:val="20"/>
+      </w:rPr>
+    </w:lvl>
+    <w:lvl w:ilvl="3" w:tentative="1">
+      <w:start w:val="1"/>
+      <w:numFmt w:val="bullet"/>
+      <w:lvlText w:val=""/>
+      <w:lvlJc w:val="left"/>
+      <w:pPr>
+        <w:tabs>
+          <w:tab w:val="num" w:pos="2880"/>
+        </w:tabs>
+        <w:ind w:left="2880" w:hanging="360"/>
+      </w:pPr>
+      <w:rPr>
+        <w:rFonts w:ascii="Wingdings" w:hAnsi="Wingdings" w:hint="default"/>
+        <w:sz w:val="20"/>
+      </w:rPr>
+    </w:lvl>
+    <w:lvl w:ilvl="4" w:tentative="1">
+      <w:start w:val="1"/>
+      <w:numFmt w:val="bullet"/>
+      <w:lvlText w:val=""/>
+      <w:lvlJc w:val="left"/>
+      <w:pPr>
+        <w:tabs>
+          <w:tab w:val="num" w:pos="3600"/>
+        </w:tabs>
+        <w:ind w:left="3600" w:hanging="360"/>
+      </w:pPr>
+      <w:rPr>
+        <w:rFonts w:ascii="Wingdings" w:hAnsi="Wingdings" w:hint="default"/>
+        <w:sz w:val="20"/>
+      </w:rPr>
+    </w:lvl>
+    <w:lvl w:ilvl="5" w:tentative="1">
+      <w:start w:val="1"/>
+      <w:numFmt w:val="bullet"/>
+      <w:lvlText w:val=""/>
+      <w:lvlJc w:val="left"/>
+      <w:pPr>
+        <w:tabs>
+          <w:tab w:val="num" w:pos="4320"/>
+        </w:tabs>
+        <w:ind w:left="4320" w:hanging="360"/>
+      </w:pPr>
+      <w:rPr>
+        <w:rFonts w:ascii="Wingdings" w:hAnsi="Wingdings" w:hint="default"/>
+        <w:sz w:val="20"/>
+      </w:rPr>
+    </w:lvl>
+    <w:lvl w:ilvl="6" w:tentative="1">
+      <w:start w:val="1"/>
+      <w:numFmt w:val="bullet"/>
+      <w:lvlText w:val=""/>
+      <w:lvlJc w:val="left"/>
+      <w:pPr>
+        <w:tabs>
+          <w:tab w:val="num" w:pos="5040"/>
+        </w:tabs>
+        <w:ind w:left="5040" w:hanging="360"/>
+      </w:pPr>
+      <w:rPr>
+        <w:rFonts w:ascii="Wingdings" w:hAnsi="Wingdings" w:hint="default"/>
+        <w:sz w:val="20"/>
+      </w:rPr>
+    </w:lvl>
+    <w:lvl w:ilvl="7" w:tentative="1">
+      <w:start w:val="1"/>
+      <w:numFmt w:val="bullet"/>
+      <w:lvlText w:val=""/>
+      <w:lvlJc w:val="left"/>
+      <w:pPr>
+        <w:tabs>
+          <w:tab w:val="num" w:pos="5760"/>
+        </w:tabs>
+        <w:ind w:left="5760" w:hanging="360"/>
+      </w:pPr>
+      <w:rPr>
+        <w:rFonts w:ascii="Wingdings" w:hAnsi="Wingdings" w:hint="default"/>
+        <w:sz w:val="20"/>
+      </w:rPr>
+    </w:lvl>
+    <w:lvl w:ilvl="8" w:tentative="1">
+      <w:start w:val="1"/>
+      <w:numFmt w:val="bullet"/>
+      <w:lvlText w:val=""/>
+      <w:lvlJc w:val="left"/>
+      <w:pPr>
+        <w:tabs>
+          <w:tab w:val="num" w:pos="6480"/>
+        </w:tabs>
+        <w:ind w:left="6480" w:hanging="360"/>
+      </w:pPr>
+      <w:rPr>
+        <w:rFonts w:ascii="Wingdings" w:hAnsi="Wingdings" w:hint="default"/>
+        <w:sz w:val="20"/>
+      </w:rPr>
+    </w:lvl>
+  </w:abstractNum>
+  <w:abstractNum w:abstractNumId="6" w15:restartNumberingAfterBreak="0">
     <w:nsid w:val="39180DB8"/>
     <w:multiLevelType w:val="multilevel"/>
     <w:tmpl w:val="10FA9C80"/>
@@ -1515,7 +2570,7 @@
       </w:rPr>
     </w:lvl>
   </w:abstractNum>
-  <w:abstractNum w:abstractNumId="5" w15:restartNumberingAfterBreak="0">
+  <w:abstractNum w:abstractNumId="7" w15:restartNumberingAfterBreak="0">
     <w:nsid w:val="3D163F8C"/>
     <w:multiLevelType w:val="hybridMultilevel"/>
     <w:tmpl w:val="18364C4E"/>
@@ -1601,7 +2656,7 @@
       </w:pPr>
     </w:lvl>
   </w:abstractNum>
-  <w:abstractNum w:abstractNumId="6" w15:restartNumberingAfterBreak="0">
+  <w:abstractNum w:abstractNumId="8" w15:restartNumberingAfterBreak="0">
     <w:nsid w:val="72D938B5"/>
     <w:multiLevelType w:val="multilevel"/>
     <w:tmpl w:val="82A0B812"/>
@@ -1750,11 +2805,309 @@
       </w:rPr>
     </w:lvl>
   </w:abstractNum>
+  <w:abstractNum w:abstractNumId="9" w15:restartNumberingAfterBreak="0">
+    <w:nsid w:val="736F36DD"/>
+    <w:multiLevelType w:val="multilevel"/>
+    <w:tmpl w:val="039AA15C"/>
+    <w:lvl w:ilvl="0">
+      <w:start w:val="1"/>
+      <w:numFmt w:val="bullet"/>
+      <w:lvlText w:val=""/>
+      <w:lvlJc w:val="left"/>
+      <w:pPr>
+        <w:tabs>
+          <w:tab w:val="num" w:pos="720"/>
+        </w:tabs>
+        <w:ind w:left="720" w:hanging="360"/>
+      </w:pPr>
+      <w:rPr>
+        <w:rFonts w:ascii="Symbol" w:hAnsi="Symbol" w:hint="default"/>
+        <w:sz w:val="20"/>
+      </w:rPr>
+    </w:lvl>
+    <w:lvl w:ilvl="1">
+      <w:start w:val="1"/>
+      <w:numFmt w:val="bullet"/>
+      <w:lvlText w:val="o"/>
+      <w:lvlJc w:val="left"/>
+      <w:pPr>
+        <w:tabs>
+          <w:tab w:val="num" w:pos="1440"/>
+        </w:tabs>
+        <w:ind w:left="1440" w:hanging="360"/>
+      </w:pPr>
+      <w:rPr>
+        <w:rFonts w:ascii="Courier New" w:hAnsi="Courier New" w:hint="default"/>
+        <w:sz w:val="20"/>
+      </w:rPr>
+    </w:lvl>
+    <w:lvl w:ilvl="2" w:tentative="1">
+      <w:start w:val="1"/>
+      <w:numFmt w:val="bullet"/>
+      <w:lvlText w:val=""/>
+      <w:lvlJc w:val="left"/>
+      <w:pPr>
+        <w:tabs>
+          <w:tab w:val="num" w:pos="2160"/>
+        </w:tabs>
+        <w:ind w:left="2160" w:hanging="360"/>
+      </w:pPr>
+      <w:rPr>
+        <w:rFonts w:ascii="Wingdings" w:hAnsi="Wingdings" w:hint="default"/>
+        <w:sz w:val="20"/>
+      </w:rPr>
+    </w:lvl>
+    <w:lvl w:ilvl="3" w:tentative="1">
+      <w:start w:val="1"/>
+      <w:numFmt w:val="bullet"/>
+      <w:lvlText w:val=""/>
+      <w:lvlJc w:val="left"/>
+      <w:pPr>
+        <w:tabs>
+          <w:tab w:val="num" w:pos="2880"/>
+        </w:tabs>
+        <w:ind w:left="2880" w:hanging="360"/>
+      </w:pPr>
+      <w:rPr>
+        <w:rFonts w:ascii="Wingdings" w:hAnsi="Wingdings" w:hint="default"/>
+        <w:sz w:val="20"/>
+      </w:rPr>
+    </w:lvl>
+    <w:lvl w:ilvl="4" w:tentative="1">
+      <w:start w:val="1"/>
+      <w:numFmt w:val="bullet"/>
+      <w:lvlText w:val=""/>
+      <w:lvlJc w:val="left"/>
+      <w:pPr>
+        <w:tabs>
+          <w:tab w:val="num" w:pos="3600"/>
+        </w:tabs>
+        <w:ind w:left="3600" w:hanging="360"/>
+      </w:pPr>
+      <w:rPr>
+        <w:rFonts w:ascii="Wingdings" w:hAnsi="Wingdings" w:hint="default"/>
+        <w:sz w:val="20"/>
+      </w:rPr>
+    </w:lvl>
+    <w:lvl w:ilvl="5" w:tentative="1">
+      <w:start w:val="1"/>
+      <w:numFmt w:val="bullet"/>
+      <w:lvlText w:val=""/>
+      <w:lvlJc w:val="left"/>
+      <w:pPr>
+        <w:tabs>
+          <w:tab w:val="num" w:pos="4320"/>
+        </w:tabs>
+        <w:ind w:left="4320" w:hanging="360"/>
+      </w:pPr>
+      <w:rPr>
+        <w:rFonts w:ascii="Wingdings" w:hAnsi="Wingdings" w:hint="default"/>
+        <w:sz w:val="20"/>
+      </w:rPr>
+    </w:lvl>
+    <w:lvl w:ilvl="6" w:tentative="1">
+      <w:start w:val="1"/>
+      <w:numFmt w:val="bullet"/>
+      <w:lvlText w:val=""/>
+      <w:lvlJc w:val="left"/>
+      <w:pPr>
+        <w:tabs>
+          <w:tab w:val="num" w:pos="5040"/>
+        </w:tabs>
+        <w:ind w:left="5040" w:hanging="360"/>
+      </w:pPr>
+      <w:rPr>
+        <w:rFonts w:ascii="Wingdings" w:hAnsi="Wingdings" w:hint="default"/>
+        <w:sz w:val="20"/>
+      </w:rPr>
+    </w:lvl>
+    <w:lvl w:ilvl="7" w:tentative="1">
+      <w:start w:val="1"/>
+      <w:numFmt w:val="bullet"/>
+      <w:lvlText w:val=""/>
+      <w:lvlJc w:val="left"/>
+      <w:pPr>
+        <w:tabs>
+          <w:tab w:val="num" w:pos="5760"/>
+        </w:tabs>
+        <w:ind w:left="5760" w:hanging="360"/>
+      </w:pPr>
+      <w:rPr>
+        <w:rFonts w:ascii="Wingdings" w:hAnsi="Wingdings" w:hint="default"/>
+        <w:sz w:val="20"/>
+      </w:rPr>
+    </w:lvl>
+    <w:lvl w:ilvl="8" w:tentative="1">
+      <w:start w:val="1"/>
+      <w:numFmt w:val="bullet"/>
+      <w:lvlText w:val=""/>
+      <w:lvlJc w:val="left"/>
+      <w:pPr>
+        <w:tabs>
+          <w:tab w:val="num" w:pos="6480"/>
+        </w:tabs>
+        <w:ind w:left="6480" w:hanging="360"/>
+      </w:pPr>
+      <w:rPr>
+        <w:rFonts w:ascii="Wingdings" w:hAnsi="Wingdings" w:hint="default"/>
+        <w:sz w:val="20"/>
+      </w:rPr>
+    </w:lvl>
+  </w:abstractNum>
+  <w:abstractNum w:abstractNumId="10" w15:restartNumberingAfterBreak="0">
+    <w:nsid w:val="7AC81C44"/>
+    <w:multiLevelType w:val="multilevel"/>
+    <w:tmpl w:val="396098C2"/>
+    <w:lvl w:ilvl="0">
+      <w:start w:val="1"/>
+      <w:numFmt w:val="bullet"/>
+      <w:lvlText w:val=""/>
+      <w:lvlJc w:val="left"/>
+      <w:pPr>
+        <w:tabs>
+          <w:tab w:val="num" w:pos="720"/>
+        </w:tabs>
+        <w:ind w:left="720" w:hanging="360"/>
+      </w:pPr>
+      <w:rPr>
+        <w:rFonts w:ascii="Symbol" w:hAnsi="Symbol" w:hint="default"/>
+        <w:sz w:val="20"/>
+      </w:rPr>
+    </w:lvl>
+    <w:lvl w:ilvl="1">
+      <w:start w:val="1"/>
+      <w:numFmt w:val="bullet"/>
+      <w:lvlText w:val="o"/>
+      <w:lvlJc w:val="left"/>
+      <w:pPr>
+        <w:tabs>
+          <w:tab w:val="num" w:pos="1440"/>
+        </w:tabs>
+        <w:ind w:left="1440" w:hanging="360"/>
+      </w:pPr>
+      <w:rPr>
+        <w:rFonts w:ascii="Courier New" w:hAnsi="Courier New" w:hint="default"/>
+        <w:sz w:val="20"/>
+      </w:rPr>
+    </w:lvl>
+    <w:lvl w:ilvl="2" w:tentative="1">
+      <w:start w:val="1"/>
+      <w:numFmt w:val="bullet"/>
+      <w:lvlText w:val=""/>
+      <w:lvlJc w:val="left"/>
+      <w:pPr>
+        <w:tabs>
+          <w:tab w:val="num" w:pos="2160"/>
+        </w:tabs>
+        <w:ind w:left="2160" w:hanging="360"/>
+      </w:pPr>
+      <w:rPr>
+        <w:rFonts w:ascii="Wingdings" w:hAnsi="Wingdings" w:hint="default"/>
+        <w:sz w:val="20"/>
+      </w:rPr>
+    </w:lvl>
+    <w:lvl w:ilvl="3" w:tentative="1">
+      <w:start w:val="1"/>
+      <w:numFmt w:val="bullet"/>
+      <w:lvlText w:val=""/>
+      <w:lvlJc w:val="left"/>
+      <w:pPr>
+        <w:tabs>
+          <w:tab w:val="num" w:pos="2880"/>
+        </w:tabs>
+        <w:ind w:left="2880" w:hanging="360"/>
+      </w:pPr>
+      <w:rPr>
+        <w:rFonts w:ascii="Wingdings" w:hAnsi="Wingdings" w:hint="default"/>
+        <w:sz w:val="20"/>
+      </w:rPr>
+    </w:lvl>
+    <w:lvl w:ilvl="4" w:tentative="1">
+      <w:start w:val="1"/>
+      <w:numFmt w:val="bullet"/>
+      <w:lvlText w:val=""/>
+      <w:lvlJc w:val="left"/>
+      <w:pPr>
+        <w:tabs>
+          <w:tab w:val="num" w:pos="3600"/>
+        </w:tabs>
+        <w:ind w:left="3600" w:hanging="360"/>
+      </w:pPr>
+      <w:rPr>
+        <w:rFonts w:ascii="Wingdings" w:hAnsi="Wingdings" w:hint="default"/>
+        <w:sz w:val="20"/>
+      </w:rPr>
+    </w:lvl>
+    <w:lvl w:ilvl="5" w:tentative="1">
+      <w:start w:val="1"/>
+      <w:numFmt w:val="bullet"/>
+      <w:lvlText w:val=""/>
+      <w:lvlJc w:val="left"/>
+      <w:pPr>
+        <w:tabs>
+          <w:tab w:val="num" w:pos="4320"/>
+        </w:tabs>
+        <w:ind w:left="4320" w:hanging="360"/>
+      </w:pPr>
+      <w:rPr>
+        <w:rFonts w:ascii="Wingdings" w:hAnsi="Wingdings" w:hint="default"/>
+        <w:sz w:val="20"/>
+      </w:rPr>
+    </w:lvl>
+    <w:lvl w:ilvl="6" w:tentative="1">
+      <w:start w:val="1"/>
+      <w:numFmt w:val="bullet"/>
+      <w:lvlText w:val=""/>
+      <w:lvlJc w:val="left"/>
+      <w:pPr>
+        <w:tabs>
+          <w:tab w:val="num" w:pos="5040"/>
+        </w:tabs>
+        <w:ind w:left="5040" w:hanging="360"/>
+      </w:pPr>
+      <w:rPr>
+        <w:rFonts w:ascii="Wingdings" w:hAnsi="Wingdings" w:hint="default"/>
+        <w:sz w:val="20"/>
+      </w:rPr>
+    </w:lvl>
+    <w:lvl w:ilvl="7" w:tentative="1">
+      <w:start w:val="1"/>
+      <w:numFmt w:val="bullet"/>
+      <w:lvlText w:val=""/>
+      <w:lvlJc w:val="left"/>
+      <w:pPr>
+        <w:tabs>
+          <w:tab w:val="num" w:pos="5760"/>
+        </w:tabs>
+        <w:ind w:left="5760" w:hanging="360"/>
+      </w:pPr>
+      <w:rPr>
+        <w:rFonts w:ascii="Wingdings" w:hAnsi="Wingdings" w:hint="default"/>
+        <w:sz w:val="20"/>
+      </w:rPr>
+    </w:lvl>
+    <w:lvl w:ilvl="8" w:tentative="1">
+      <w:start w:val="1"/>
+      <w:numFmt w:val="bullet"/>
+      <w:lvlText w:val=""/>
+      <w:lvlJc w:val="left"/>
+      <w:pPr>
+        <w:tabs>
+          <w:tab w:val="num" w:pos="6480"/>
+        </w:tabs>
+        <w:ind w:left="6480" w:hanging="360"/>
+      </w:pPr>
+      <w:rPr>
+        <w:rFonts w:ascii="Wingdings" w:hAnsi="Wingdings" w:hint="default"/>
+        <w:sz w:val="20"/>
+      </w:rPr>
+    </w:lvl>
+  </w:abstractNum>
   <w:num w:numId="1" w16cid:durableId="1166700646">
-    <w:abstractNumId w:val="3"/>
+    <w:abstractNumId w:val="4"/>
   </w:num>
   <w:num w:numId="2" w16cid:durableId="1083795840">
-    <w:abstractNumId w:val="4"/>
+    <w:abstractNumId w:val="6"/>
   </w:num>
   <w:num w:numId="3" w16cid:durableId="453716707">
     <w:abstractNumId w:val="2"/>
@@ -1763,12 +3116,24 @@
     <w:abstractNumId w:val="0"/>
   </w:num>
   <w:num w:numId="5" w16cid:durableId="537669584">
-    <w:abstractNumId w:val="6"/>
+    <w:abstractNumId w:val="8"/>
   </w:num>
   <w:num w:numId="6" w16cid:durableId="334038292">
     <w:abstractNumId w:val="1"/>
   </w:num>
   <w:num w:numId="7" w16cid:durableId="446505053">
+    <w:abstractNumId w:val="7"/>
+  </w:num>
+  <w:num w:numId="8" w16cid:durableId="583884285">
+    <w:abstractNumId w:val="3"/>
+  </w:num>
+  <w:num w:numId="9" w16cid:durableId="1815295605">
+    <w:abstractNumId w:val="10"/>
+  </w:num>
+  <w:num w:numId="10" w16cid:durableId="1926836074">
+    <w:abstractNumId w:val="9"/>
+  </w:num>
+  <w:num w:numId="11" w16cid:durableId="1567689382">
     <w:abstractNumId w:val="5"/>
   </w:num>
 </w:numbering>
@@ -2377,7 +3742,6 @@
   <w:style w:type="character" w:default="1" w:styleId="DefaultParagraphFont">
     <w:name w:val="Default Paragraph Font"/>
     <w:uiPriority w:val="1"/>
-    <w:semiHidden/>
     <w:unhideWhenUsed/>
   </w:style>
   <w:style w:type="table" w:default="1" w:styleId="TableNormal">

</xml_diff>